<commit_message>
Update CloudBridge judges one pager
</commit_message>
<xml_diff>
--- a/CloudBridge_Judges_OnePager.docx
+++ b/CloudBridge_Judges_OnePager.docx
@@ -4,48 +4,48 @@
   <w:body>
     <w:p>
       <w:pPr>
-        <w:spacing w:after="40"/>
+        <w:spacing w:after="20"/>
         <w:jc w:val="center"/>
       </w:pPr>
       <w:r>
         <w:rPr>
           <w:b/>
           <w:color w:val="1F4E79"/>
-          <w:sz w:val="32"/>
+          <w:sz w:val="30"/>
         </w:rPr>
         <w:t>CloudBridge: Agentic AWS-to-Google Cloud Migration Assistant</w:t>
       </w:r>
     </w:p>
     <w:p>
       <w:pPr>
-        <w:spacing w:after="160"/>
+        <w:spacing w:after="140"/>
         <w:jc w:val="center"/>
       </w:pPr>
       <w:r>
         <w:rPr>
           <w:i/>
           <w:color w:val="505050"/>
-          <w:sz w:val="20"/>
+          <w:sz w:val="19"/>
         </w:rPr>
-        <w:t>Google ADK hackathon demo: CloudFormation in → GCP Terraform + compliance review out</w:t>
+        <w:t>Google ADK demo: CloudFormation in → GCP Terraform + compliance remediations out</w:t>
       </w:r>
     </w:p>
     <w:p>
       <w:pPr>
-        <w:spacing w:after="80"/>
+        <w:spacing w:after="60"/>
       </w:pPr>
       <w:r>
         <w:rPr>
           <w:b/>
           <w:color w:val="1F4E79"/>
-          <w:sz w:val="22"/>
+          <w:sz w:val="21"/>
         </w:rPr>
         <w:t>What it does</w:t>
       </w:r>
     </w:p>
     <w:p>
       <w:pPr>
-        <w:spacing w:after="120"/>
+        <w:spacing w:after="100"/>
       </w:pPr>
       <w:r>
         <w:rPr>
@@ -54,25 +54,25 @@
         <w:t xml:space="preserve">CloudBridge helps teams understand and migrate small AWS CloudFormation architectures to Google Cloud. </w:t>
       </w:r>
       <w:r>
-        <w:t>A user can chat with the assistant, ask it to inspect project files, choose an input template, and then request a conversion. The system maps AWS resources to GCP services, generates starter Terraform, and produces a security/compliance summary for review.</w:t>
+        <w:t>A conversational agent can answer questions, inspect project files, ask for the right input, then run a conversion pipeline that maps AWS resources to GCP services, generates starter Terraform, and explains security fixes.</w:t>
       </w:r>
     </w:p>
     <w:p>
       <w:pPr>
-        <w:spacing w:after="80"/>
+        <w:spacing w:after="60"/>
       </w:pPr>
       <w:r>
         <w:rPr>
           <w:b/>
           <w:color w:val="1F4E79"/>
-          <w:sz w:val="22"/>
+          <w:sz w:val="21"/>
         </w:rPr>
         <w:t>Agents we built</w:t>
       </w:r>
     </w:p>
     <w:p>
       <w:pPr>
-        <w:spacing w:after="80"/>
+        <w:spacing w:after="60"/>
       </w:pPr>
       <w:r>
         <w:rPr>
@@ -89,15 +89,15 @@
         <w:tblLook w:firstColumn="1" w:firstRow="1" w:lastColumn="0" w:lastRow="0" w:noHBand="0" w:noVBand="1" w:val="04A0"/>
       </w:tblPr>
       <w:tblGrid>
-        <w:gridCol w:w="2581"/>
-        <w:gridCol w:w="2581"/>
-        <w:gridCol w:w="2581"/>
-        <w:gridCol w:w="2581"/>
+        <w:gridCol w:w="2603"/>
+        <w:gridCol w:w="2603"/>
+        <w:gridCol w:w="2603"/>
+        <w:gridCol w:w="2603"/>
       </w:tblGrid>
       <w:tr>
         <w:tc>
           <w:tcPr>
-            <w:tcW w:type="dxa" w:w="2581"/>
+            <w:tcW w:type="dxa" w:w="2603"/>
             <w:shd w:fill="D9EAF7"/>
           </w:tcPr>
           <w:p>
@@ -108,7 +108,7 @@
             <w:r>
               <w:rPr>
                 <w:b/>
-                <w:sz w:val="17"/>
+                <w:sz w:val="15"/>
               </w:rPr>
               <w:t>#</w:t>
             </w:r>
@@ -116,7 +116,7 @@
         </w:tc>
         <w:tc>
           <w:tcPr>
-            <w:tcW w:type="dxa" w:w="2581"/>
+            <w:tcW w:type="dxa" w:w="2603"/>
             <w:shd w:fill="D9EAF7"/>
           </w:tcPr>
           <w:p>
@@ -127,7 +127,7 @@
             <w:r>
               <w:rPr>
                 <w:b/>
-                <w:sz w:val="17"/>
+                <w:sz w:val="15"/>
               </w:rPr>
               <w:t>Agent</w:t>
             </w:r>
@@ -135,7 +135,7 @@
         </w:tc>
         <w:tc>
           <w:tcPr>
-            <w:tcW w:type="dxa" w:w="2581"/>
+            <w:tcW w:type="dxa" w:w="2603"/>
             <w:shd w:fill="D9EAF7"/>
           </w:tcPr>
           <w:p>
@@ -146,7 +146,7 @@
             <w:r>
               <w:rPr>
                 <w:b/>
-                <w:sz w:val="17"/>
+                <w:sz w:val="15"/>
               </w:rPr>
               <w:t>Role</w:t>
             </w:r>
@@ -154,7 +154,7 @@
         </w:tc>
         <w:tc>
           <w:tcPr>
-            <w:tcW w:type="dxa" w:w="2581"/>
+            <w:tcW w:type="dxa" w:w="2603"/>
             <w:shd w:fill="D9EAF7"/>
           </w:tcPr>
           <w:p>
@@ -165,7 +165,7 @@
             <w:r>
               <w:rPr>
                 <w:b/>
-                <w:sz w:val="17"/>
+                <w:sz w:val="15"/>
               </w:rPr>
               <w:t>What it does</w:t>
             </w:r>
@@ -175,7 +175,7 @@
       <w:tr>
         <w:tc>
           <w:tcPr>
-            <w:tcW w:type="dxa" w:w="2581"/>
+            <w:tcW w:type="dxa" w:w="2603"/>
             <w:vAlign w:val="top"/>
           </w:tcPr>
           <w:p>
@@ -186,7 +186,7 @@
             <w:r>
               <w:rPr>
                 <w:b w:val="0"/>
-                <w:sz w:val="16"/>
+                <w:sz w:val="14"/>
               </w:rPr>
               <w:t>1</w:t>
             </w:r>
@@ -194,7 +194,7 @@
         </w:tc>
         <w:tc>
           <w:tcPr>
-            <w:tcW w:type="dxa" w:w="2581"/>
+            <w:tcW w:type="dxa" w:w="2603"/>
             <w:vAlign w:val="top"/>
           </w:tcPr>
           <w:p>
@@ -205,7 +205,7 @@
             <w:r>
               <w:rPr>
                 <w:b w:val="0"/>
-                <w:sz w:val="16"/>
+                <w:sz w:val="14"/>
               </w:rPr>
               <w:t>cloudbridge_architect</w:t>
             </w:r>
@@ -213,7 +213,7 @@
         </w:tc>
         <w:tc>
           <w:tcPr>
-            <w:tcW w:type="dxa" w:w="2581"/>
+            <w:tcW w:type="dxa" w:w="2603"/>
             <w:vAlign w:val="top"/>
           </w:tcPr>
           <w:p>
@@ -224,7 +224,7 @@
             <w:r>
               <w:rPr>
                 <w:b w:val="0"/>
-                <w:sz w:val="16"/>
+                <w:sz w:val="14"/>
               </w:rPr>
               <w:t>Conversational coordinator</w:t>
             </w:r>
@@ -232,7 +232,7 @@
         </w:tc>
         <w:tc>
           <w:tcPr>
-            <w:tcW w:type="dxa" w:w="2581"/>
+            <w:tcW w:type="dxa" w:w="2603"/>
             <w:vAlign w:val="top"/>
           </w:tcPr>
           <w:p>
@@ -243,7 +243,7 @@
             <w:r>
               <w:rPr>
                 <w:b w:val="0"/>
-                <w:sz w:val="16"/>
+                <w:sz w:val="14"/>
               </w:rPr>
               <w:t>Talks with the human, lists/reads files, asks clarifying questions, and delegates only when conversion is requested.</w:t>
             </w:r>
@@ -253,7 +253,7 @@
       <w:tr>
         <w:tc>
           <w:tcPr>
-            <w:tcW w:type="dxa" w:w="2581"/>
+            <w:tcW w:type="dxa" w:w="2603"/>
             <w:vAlign w:val="top"/>
           </w:tcPr>
           <w:p>
@@ -264,7 +264,7 @@
             <w:r>
               <w:rPr>
                 <w:b w:val="0"/>
-                <w:sz w:val="16"/>
+                <w:sz w:val="14"/>
               </w:rPr>
               <w:t>2</w:t>
             </w:r>
@@ -272,7 +272,7 @@
         </w:tc>
         <w:tc>
           <w:tcPr>
-            <w:tcW w:type="dxa" w:w="2581"/>
+            <w:tcW w:type="dxa" w:w="2603"/>
             <w:vAlign w:val="top"/>
           </w:tcPr>
           <w:p>
@@ -283,7 +283,7 @@
             <w:r>
               <w:rPr>
                 <w:b w:val="0"/>
-                <w:sz w:val="16"/>
+                <w:sz w:val="14"/>
               </w:rPr>
               <w:t>source_loader</w:t>
             </w:r>
@@ -291,7 +291,7 @@
         </w:tc>
         <w:tc>
           <w:tcPr>
-            <w:tcW w:type="dxa" w:w="2581"/>
+            <w:tcW w:type="dxa" w:w="2603"/>
             <w:vAlign w:val="top"/>
           </w:tcPr>
           <w:p>
@@ -302,7 +302,7 @@
             <w:r>
               <w:rPr>
                 <w:b w:val="0"/>
-                <w:sz w:val="16"/>
+                <w:sz w:val="14"/>
               </w:rPr>
               <w:t>Input agent</w:t>
             </w:r>
@@ -310,7 +310,7 @@
         </w:tc>
         <w:tc>
           <w:tcPr>
-            <w:tcW w:type="dxa" w:w="2581"/>
+            <w:tcW w:type="dxa" w:w="2603"/>
             <w:vAlign w:val="top"/>
           </w:tcPr>
           <w:p>
@@ -321,9 +321,9 @@
             <w:r>
               <w:rPr>
                 <w:b w:val="0"/>
-                <w:sz w:val="16"/>
+                <w:sz w:val="14"/>
               </w:rPr>
-              <w:t>Loads the selected CloudFormation file, such as input/sample-three-tier.yaml.</w:t>
+              <w:t>Loads the selected CloudFormation file, such as input/sample-three-tier-insecure.yaml.</w:t>
             </w:r>
           </w:p>
         </w:tc>
@@ -331,7 +331,7 @@
       <w:tr>
         <w:tc>
           <w:tcPr>
-            <w:tcW w:type="dxa" w:w="2581"/>
+            <w:tcW w:type="dxa" w:w="2603"/>
             <w:vAlign w:val="top"/>
           </w:tcPr>
           <w:p>
@@ -342,7 +342,7 @@
             <w:r>
               <w:rPr>
                 <w:b w:val="0"/>
-                <w:sz w:val="16"/>
+                <w:sz w:val="14"/>
               </w:rPr>
               <w:t>3</w:t>
             </w:r>
@@ -350,7 +350,7 @@
         </w:tc>
         <w:tc>
           <w:tcPr>
-            <w:tcW w:type="dxa" w:w="2581"/>
+            <w:tcW w:type="dxa" w:w="2603"/>
             <w:vAlign w:val="top"/>
           </w:tcPr>
           <w:p>
@@ -361,7 +361,7 @@
             <w:r>
               <w:rPr>
                 <w:b w:val="0"/>
-                <w:sz w:val="16"/>
+                <w:sz w:val="14"/>
               </w:rPr>
               <w:t>translator</w:t>
             </w:r>
@@ -369,7 +369,7 @@
         </w:tc>
         <w:tc>
           <w:tcPr>
-            <w:tcW w:type="dxa" w:w="2581"/>
+            <w:tcW w:type="dxa" w:w="2603"/>
             <w:vAlign w:val="top"/>
           </w:tcPr>
           <w:p>
@@ -380,7 +380,7 @@
             <w:r>
               <w:rPr>
                 <w:b w:val="0"/>
-                <w:sz w:val="16"/>
+                <w:sz w:val="14"/>
               </w:rPr>
               <w:t>Architecture mapping agent</w:t>
             </w:r>
@@ -388,7 +388,7 @@
         </w:tc>
         <w:tc>
           <w:tcPr>
-            <w:tcW w:type="dxa" w:w="2581"/>
+            <w:tcW w:type="dxa" w:w="2603"/>
             <w:vAlign w:val="top"/>
           </w:tcPr>
           <w:p>
@@ -399,9 +399,9 @@
             <w:r>
               <w:rPr>
                 <w:b w:val="0"/>
-                <w:sz w:val="16"/>
+                <w:sz w:val="14"/>
               </w:rPr>
-              <w:t>Maps AWS VPC, subnet, EC2, RDS, S3, IAM, and security intent to Google Cloud equivalents.</w:t>
+              <w:t>Maps AWS VPC, subnet, EC2, RDS, S3, IAM, and network security intent to GCP equivalents.</w:t>
             </w:r>
           </w:p>
         </w:tc>
@@ -409,7 +409,7 @@
       <w:tr>
         <w:tc>
           <w:tcPr>
-            <w:tcW w:type="dxa" w:w="2581"/>
+            <w:tcW w:type="dxa" w:w="2603"/>
             <w:vAlign w:val="top"/>
           </w:tcPr>
           <w:p>
@@ -420,7 +420,7 @@
             <w:r>
               <w:rPr>
                 <w:b w:val="0"/>
-                <w:sz w:val="16"/>
+                <w:sz w:val="14"/>
               </w:rPr>
               <w:t>4</w:t>
             </w:r>
@@ -428,7 +428,7 @@
         </w:tc>
         <w:tc>
           <w:tcPr>
-            <w:tcW w:type="dxa" w:w="2581"/>
+            <w:tcW w:type="dxa" w:w="2603"/>
             <w:vAlign w:val="top"/>
           </w:tcPr>
           <w:p>
@@ -439,7 +439,7 @@
             <w:r>
               <w:rPr>
                 <w:b w:val="0"/>
-                <w:sz w:val="16"/>
+                <w:sz w:val="14"/>
               </w:rPr>
               <w:t>terraform_writer</w:t>
             </w:r>
@@ -447,7 +447,7 @@
         </w:tc>
         <w:tc>
           <w:tcPr>
-            <w:tcW w:type="dxa" w:w="2581"/>
+            <w:tcW w:type="dxa" w:w="2603"/>
             <w:vAlign w:val="top"/>
           </w:tcPr>
           <w:p>
@@ -458,7 +458,7 @@
             <w:r>
               <w:rPr>
                 <w:b w:val="0"/>
-                <w:sz w:val="16"/>
+                <w:sz w:val="14"/>
               </w:rPr>
               <w:t>Terraform generation agent</w:t>
             </w:r>
@@ -466,7 +466,7 @@
         </w:tc>
         <w:tc>
           <w:tcPr>
-            <w:tcW w:type="dxa" w:w="2581"/>
+            <w:tcW w:type="dxa" w:w="2603"/>
             <w:vAlign w:val="top"/>
           </w:tcPr>
           <w:p>
@@ -477,7 +477,7 @@
             <w:r>
               <w:rPr>
                 <w:b w:val="0"/>
-                <w:sz w:val="16"/>
+                <w:sz w:val="14"/>
               </w:rPr>
               <w:t>Creates starter GCP Terraform blocks for main.tf, variables.tf, iam.tf, and outputs.tf.</w:t>
             </w:r>
@@ -487,7 +487,7 @@
       <w:tr>
         <w:tc>
           <w:tcPr>
-            <w:tcW w:type="dxa" w:w="2581"/>
+            <w:tcW w:type="dxa" w:w="2603"/>
             <w:vAlign w:val="top"/>
           </w:tcPr>
           <w:p>
@@ -498,7 +498,7 @@
             <w:r>
               <w:rPr>
                 <w:b w:val="0"/>
-                <w:sz w:val="16"/>
+                <w:sz w:val="14"/>
               </w:rPr>
               <w:t>5</w:t>
             </w:r>
@@ -506,7 +506,7 @@
         </w:tc>
         <w:tc>
           <w:tcPr>
-            <w:tcW w:type="dxa" w:w="2581"/>
+            <w:tcW w:type="dxa" w:w="2603"/>
             <w:vAlign w:val="top"/>
           </w:tcPr>
           <w:p>
@@ -517,7 +517,7 @@
             <w:r>
               <w:rPr>
                 <w:b w:val="0"/>
-                <w:sz w:val="16"/>
+                <w:sz w:val="14"/>
               </w:rPr>
               <w:t>compliance_reviewer</w:t>
             </w:r>
@@ -525,7 +525,7 @@
         </w:tc>
         <w:tc>
           <w:tcPr>
-            <w:tcW w:type="dxa" w:w="2581"/>
+            <w:tcW w:type="dxa" w:w="2603"/>
             <w:vAlign w:val="top"/>
           </w:tcPr>
           <w:p>
@@ -536,7 +536,7 @@
             <w:r>
               <w:rPr>
                 <w:b w:val="0"/>
-                <w:sz w:val="16"/>
+                <w:sz w:val="14"/>
               </w:rPr>
               <w:t>Security review agent</w:t>
             </w:r>
@@ -544,7 +544,7 @@
         </w:tc>
         <w:tc>
           <w:tcPr>
-            <w:tcW w:type="dxa" w:w="2581"/>
+            <w:tcW w:type="dxa" w:w="2603"/>
             <w:vAlign w:val="top"/>
           </w:tcPr>
           <w:p>
@@ -555,9 +555,9 @@
             <w:r>
               <w:rPr>
                 <w:b w:val="0"/>
-                <w:sz w:val="16"/>
+                <w:sz w:val="14"/>
               </w:rPr>
-              <w:t>Checks for public databases/buckets, open firewall rules, broad IAM, and missing protections.</w:t>
+              <w:t>Reports PASS, PASS WITH REMEDIATIONS, NEEDS REVIEW, or FAIL with severity, fixes, and residual review items.</w:t>
             </w:r>
           </w:p>
         </w:tc>
@@ -565,34 +565,48 @@
     </w:tbl>
     <w:p>
       <w:pPr>
-        <w:spacing w:before="120" w:after="80"/>
+        <w:spacing w:before="100" w:after="60"/>
       </w:pPr>
       <w:r>
         <w:rPr>
           <w:b/>
           <w:color w:val="1F4E79"/>
-          <w:sz w:val="22"/>
+          <w:sz w:val="21"/>
         </w:rPr>
-        <w:t>How it works</w:t>
+        <w:t>How the workflow runs</w:t>
       </w:r>
     </w:p>
     <w:p>
       <w:pPr>
-        <w:spacing w:after="120"/>
+        <w:spacing w:after="100"/>
         <w:jc w:val="center"/>
       </w:pPr>
       <w:r>
         <w:rPr>
           <w:b/>
           <w:color w:val="1F4E79"/>
-          <w:sz w:val="19"/>
+          <w:sz w:val="18"/>
         </w:rPr>
-        <w:t>Human chat → Conversational coordinator → Conversion pipeline → Terraform bundle → Compliance report</w:t>
+        <w:t>Human chat → cloudbridge_architect → conversion_pipeline → GCP Terraform → Compliance Report</w:t>
       </w:r>
     </w:p>
     <w:p>
       <w:pPr>
-        <w:spacing w:after="40"/>
+        <w:spacing w:after="100"/>
+        <w:jc w:val="center"/>
+      </w:pPr>
+      <w:r>
+        <w:rPr>
+          <w:rFonts w:ascii="Aptos Mono" w:hAnsi="Aptos Mono" w:eastAsia="Aptos Mono"/>
+          <w:color w:val="464646"/>
+          <w:sz w:val="15"/>
+        </w:rPr>
+        <w:t>AWS CloudFormation  ──▶  CloudBridge Agents  ──▶  GCP Terraform  ──▶  PASS WITH REMEDIATIONS / NEEDS REVIEW</w:t>
+      </w:r>
+    </w:p>
+    <w:p>
+      <w:pPr>
+        <w:spacing w:after="30"/>
         <w:ind w:left="259" w:hanging="259"/>
       </w:pPr>
       <w:r>
@@ -602,12 +616,12 @@
         <w:t xml:space="preserve">• </w:t>
       </w:r>
       <w:r>
-        <w:t>Built with Google ADK using a conversational root LLM agent plus a SequentialAgent conversion pipeline.</w:t>
+        <w:t>Conversational first: saying “hi” does not run conversion; the coordinator asks what the user wants to inspect or migrate.</w:t>
       </w:r>
     </w:p>
     <w:p>
       <w:pPr>
-        <w:spacing w:after="40"/>
+        <w:spacing w:after="30"/>
         <w:ind w:left="259" w:hanging="259"/>
       </w:pPr>
       <w:r>
@@ -617,12 +631,12 @@
         <w:t xml:space="preserve">• </w:t>
       </w:r>
       <w:r>
-        <w:t>Uses safe file tools only for project input/output access; the migration reasoning is handled by agents.</w:t>
+        <w:t>Conversion on demand: when the user asks to convert a template, the SequentialAgent pipeline runs source_loader → translator → terraform_writer → compliance_reviewer.</w:t>
       </w:r>
     </w:p>
     <w:p>
       <w:pPr>
-        <w:spacing w:after="40"/>
+        <w:spacing w:after="30"/>
         <w:ind w:left="259" w:hanging="259"/>
       </w:pPr>
       <w:r>
@@ -632,12 +646,12 @@
         <w:t xml:space="preserve">• </w:t>
       </w:r>
       <w:r>
-        <w:t>Supports the hackathon MVP scope: VPC/subnets, EC2/LaunchTemplate, RDS PostgreSQL, S3, IAM, and security groups/NACL intent.</w:t>
+        <w:t>Compliance is explainable: the report lists source risks, top severity remediations, what AWS resources became in GCP, and remaining human-review items.</w:t>
       </w:r>
     </w:p>
     <w:p>
       <w:pPr>
-        <w:spacing w:after="40"/>
+        <w:spacing w:after="30"/>
         <w:ind w:left="259" w:hanging="259"/>
       </w:pPr>
       <w:r>
@@ -647,12 +661,12 @@
         <w:t xml:space="preserve">• </w:t>
       </w:r>
       <w:r>
-        <w:t>Keeps outputs reviewable: generated Terraform is starter code, not an automatic production deployment.</w:t>
+        <w:t>MVP scope: VPC/subnets, EC2/LaunchTemplate, RDS PostgreSQL, S3, IAM, and security group/NACL intent.</w:t>
       </w:r>
     </w:p>
     <w:p>
       <w:pPr>
-        <w:spacing w:after="40"/>
+        <w:spacing w:after="30"/>
         <w:ind w:left="259" w:hanging="259"/>
       </w:pPr>
       <w:r>
@@ -662,18 +676,18 @@
         <w:t xml:space="preserve">• </w:t>
       </w:r>
       <w:r>
-        <w:t>Designed for a live demo: the judge can ask questions first, then trigger conversion when ready.</w:t>
+        <w:t>Generated Terraform is starter code for review, not an automatic production deployment.</w:t>
       </w:r>
     </w:p>
     <w:p>
       <w:pPr>
-        <w:spacing w:before="80" w:after="80"/>
+        <w:spacing w:before="60" w:after="60"/>
       </w:pPr>
       <w:r>
         <w:rPr>
           <w:b/>
           <w:color w:val="1F4E79"/>
-          <w:sz w:val="22"/>
+          <w:sz w:val="21"/>
         </w:rPr>
         <w:t>Why it matters</w:t>
       </w:r>
@@ -686,29 +700,29 @@
         <w:rPr>
           <w:b/>
         </w:rPr>
-        <w:t xml:space="preserve">CloudBridge turns migration from a manual, error-prone translation task into an agent-guided workflow. </w:t>
+        <w:t xml:space="preserve">CloudBridge turns migration from a manual translation task into an agent-guided workflow. </w:t>
       </w:r>
       <w:r>
-        <w:t>It gives teams a fast first draft of the target GCP architecture, Terraform, and security findings so engineers can review, improve, and deploy with confidence.</w:t>
+        <w:t>It gives teams a fast first draft of the target GCP architecture, Terraform, and prioritized security remediations so engineers can review and improve with confidence.</w:t>
       </w:r>
     </w:p>
     <w:p>
       <w:pPr>
-        <w:spacing w:before="160"/>
+        <w:spacing w:before="120"/>
         <w:jc w:val="center"/>
       </w:pPr>
       <w:r>
         <w:rPr>
           <w:i/>
           <w:color w:val="646464"/>
-          <w:sz w:val="17"/>
+          <w:sz w:val="16"/>
         </w:rPr>
         <w:t>Demo prompt: “Convert input/sample-three-tier-insecure.yaml to a GCP bundle.”</w:t>
       </w:r>
     </w:p>
     <w:sectPr>
       <w:pgSz w:w="11909" w:h="16834"/>
-      <w:pgMar w:top="648" w:right="792" w:bottom="648" w:left="792" w:header="720" w:footer="720" w:gutter="0"/>
+      <w:pgMar w:top="605" w:right="749" w:bottom="605" w:left="749" w:header="720" w:footer="720" w:gutter="0"/>
       <w:cols w:space="720"/>
       <w:docGrid w:linePitch="360"/>
     </w:sectPr>
@@ -1081,7 +1095,7 @@
     <w:rsid w:val="00FC693F"/>
     <w:rPr>
       <w:rFonts w:ascii="Aptos" w:hAnsi="Aptos" w:eastAsia="Aptos"/>
-      <w:sz w:val="18"/>
+      <w:sz w:val="17"/>
     </w:rPr>
   </w:style>
   <w:style w:type="paragraph" w:styleId="Header">

</xml_diff>